<commit_message>
Update resume summary to emphasize ownership and delivered tools
</commit_message>
<xml_diff>
--- a/kevin-murray-resume.docx
+++ b/kevin-murray-resume.docx
@@ -54,7 +54,7 @@
         <w:rPr>
           <w:b w:val="0"/>
         </w:rPr>
-        <w:t>Business Analytics graduate with SQL, NetSuite, Power BI, and AI automation experience. Full Flex’s main technical resource, managing dashboards and integrations for about 15 companies at once. Built an Excel shipping tool in two days at Revelyst.</w:t>
+        <w:t>Business Analytics graduate with experience in SQL, Power BI, NetSuite, and Excel. At Full Flex Marketing, I owned databases, AI workflows, and reporting integrations supporting about 15 companies, and built data-entry tools for users without SQL knowledge. At Revelyst, I delivered an Excel shipping tool in two days to help operations compare freight options.</w:t>
       </w:r>
     </w:p>
     <w:p>
@@ -732,7 +732,7 @@
     <w:qFormat/>
     <w:rsid w:val="00FC693F"/>
     <w:pPr>
-      <w:spacing w:after="60" w:line="240" w:lineRule="auto"/>
+      <w:spacing w:after="40" w:line="240" w:lineRule="auto"/>
     </w:pPr>
     <w:rPr>
       <w:rFonts w:ascii="Calibri" w:hAnsi="Calibri"/>
@@ -795,7 +795,7 @@
     <w:pPr>
       <w:keepNext/>
       <w:keepLines/>
-      <w:spacing w:before="140" w:after="80"/>
+      <w:spacing w:before="100" w:after="60"/>
       <w:outlineLvl w:val="0"/>
     </w:pPr>
     <w:rPr>

</xml_diff>